<commit_message>
Add Interface Triage Agent to resume
</commit_message>
<xml_diff>
--- a/Anh_Truong_(Andy)_Nguyen_Resume.docx
+++ b/Anh_Truong_(Andy)_Nguyen_Resume.docx
@@ -198,13 +198,30 @@
           <w:b/>
           <w:bCs/>
         </w:rPr>
+        <w:t>Interface Triage Agent</w:t>
+      </w:r>
+      <w:r>
+        <w:t xml:space="preserve">: Local LLM routing HL7 v2 interface errors; 95.5% of 200 faults to the right team</w:t>
+      </w:r>
+    </w:p>
+    <w:p>
+      <w:pPr>
+        <w:pStyle w:val="ListParagraph"/>
+        <w:numPr>
+          <w:ilvl w:val="0"/>
+          <w:numId w:val="2"/>
+        </w:numPr>
+        <w:spacing w:before="10" w:after="10"/>
+      </w:pPr>
+      <w:r>
+        <w:rPr>
+          <w:b/>
+          <w:bCs/>
+        </w:rPr>
         <w:t>CAR-T Neurotoxicity Watch</w:t>
       </w:r>
       <w:r>
-        <w:t>: T</w:t>
-      </w:r>
-      <w:r>
-        <w:t>rend-based ICE score alerting that flags decline 16 hours earlier; capacity and ROI model</w:t>
+        <w:t>: ICE trend alerting that flags decline 16 hours earlier; capacity/ROI model</w:t>
       </w:r>
     </w:p>
     <w:p>
@@ -224,10 +241,7 @@
         <w:t>Clinical Systems Analyst Lab</w:t>
       </w:r>
       <w:r>
-        <w:t xml:space="preserve">: </w:t>
-      </w:r>
-      <w:r>
-        <w:t>HL7 interface incident simulations and a 42-scenario Epic analyst ticket trainer</w:t>
+        <w:t xml:space="preserve">: HL7 interface incident simulations and a 42-scenario Epic analyst ticket trainer</w:t>
       </w:r>
     </w:p>
     <w:p>
@@ -247,10 +261,7 @@
         <w:t>Neuro-ICU Seizure Alert Pipeline</w:t>
       </w:r>
       <w:r>
-        <w:t>: C</w:t>
-      </w:r>
-      <w:r>
-        <w:t>ontinuous EEG alert-threshold tuning that weighs missed seizures against alert fatigue</w:t>
+        <w:t>: Continuous EEG alert-threshold tuning that weighs missed seizures against alert fatigue</w:t>
       </w:r>
     </w:p>
     <w:p>
@@ -270,10 +281,7 @@
         <w:t>Automation Governance</w:t>
       </w:r>
       <w:r>
-        <w:t xml:space="preserve">: </w:t>
-      </w:r>
-      <w:r>
-        <w:t>RPA fleet simulator covering service identity, rate limits, exception queues, and audit trails</w:t>
+        <w:t xml:space="preserve">: RPA fleet simulator covering service identity, rate limits, exception queues, and audit trails</w:t>
       </w:r>
     </w:p>
     <w:p>
@@ -556,37 +564,7 @@
         <w:spacing w:before="20" w:after="20"/>
       </w:pPr>
       <w:r>
-        <w:t>Capella University – D</w:t>
-      </w:r>
-      <w:r>
-        <w:t xml:space="preserve">octor of </w:t>
-      </w:r>
-      <w:r>
-        <w:t>B</w:t>
-      </w:r>
-      <w:r>
-        <w:t xml:space="preserve">usiness </w:t>
-      </w:r>
-      <w:r>
-        <w:t>A</w:t>
-      </w:r>
-      <w:r>
-        <w:t>dministration</w:t>
-      </w:r>
-      <w:r>
-        <w:t>, Organizational Leadership &amp; Development</w:t>
-      </w:r>
-      <w:r>
-        <w:t xml:space="preserve"> </w:t>
-      </w:r>
-      <w:r>
-        <w:t>(</w:t>
-      </w:r>
-      <w:r>
-        <w:t>in progress</w:t>
-      </w:r>
-      <w:r>
-        <w:t>)</w:t>
+        <w:t xml:space="preserve">Capella University – Doctor of Business Administration, Organizational Leadership &amp; Development (in progress)</w:t>
       </w:r>
     </w:p>
     <w:p>
@@ -594,19 +572,7 @@
         <w:spacing w:before="20" w:after="20"/>
       </w:pPr>
       <w:r>
-        <w:t>Capella University – M</w:t>
-      </w:r>
-      <w:r>
-        <w:t xml:space="preserve">aster of Business </w:t>
-      </w:r>
-      <w:r>
-        <w:t>A</w:t>
-      </w:r>
-      <w:r>
-        <w:t>dministration</w:t>
-      </w:r>
-      <w:r>
-        <w:t>, Healthcare Management</w:t>
+        <w:t xml:space="preserve">Capella University – Master of Business Administration, Healthcare Management</w:t>
       </w:r>
     </w:p>
     <w:p>
@@ -614,13 +580,7 @@
         <w:spacing w:before="40" w:after="20"/>
       </w:pPr>
       <w:r>
-        <w:t>Capella University – B</w:t>
-      </w:r>
-      <w:r>
-        <w:t>achelor of Science</w:t>
-      </w:r>
-      <w:r>
-        <w:t>, Cybersecurity &amp; Information Assurance</w:t>
+        <w:t>Capella University – Bachelor of Science, Cybersecurity &amp; Information Assurance</w:t>
       </w:r>
     </w:p>
     <w:sectPr>

</xml_diff>